<commit_message>
feat: agregar campo ID_PAA_SI_NO y ocultamiento dinamico de parrafos en plantillas
</commit_message>
<xml_diff>
--- a/plantillas/FUNCIONAMIENTO_1_ESTUDIOS_PREVIOS.docx
+++ b/plantillas/FUNCIONAMIENTO_1_ESTUDIOS_PREVIOS.docx
@@ -3359,14 +3359,12 @@
                 <w:rFonts w:ascii="Arial" w:eastAsia="Arial" w:hAnsi="Arial" w:cs="Arial"/>
               </w:rPr>
             </w:pPr>
-            <w:proofErr w:type="spellStart"/>
             <w:r>
               <w:rPr>
                 <w:rFonts w:ascii="Arial" w:eastAsia="Arial" w:hAnsi="Arial" w:cs="Arial"/>
               </w:rPr>
               <w:t>Perfil</w:t>
             </w:r>
-            <w:proofErr w:type="spellEnd"/>
           </w:p>
         </w:tc>
         <w:tc>
@@ -3713,28 +3711,12 @@
                 <w:rFonts w:ascii="Arial" w:eastAsia="Arial" w:hAnsi="Arial" w:cs="Arial"/>
               </w:rPr>
             </w:pPr>
-            <w:proofErr w:type="spellStart"/>
-            <w:r>
-              <w:rPr>
-                <w:rFonts w:ascii="Arial" w:eastAsia="Arial" w:hAnsi="Arial" w:cs="Arial"/>
-              </w:rPr>
-              <w:t>Código</w:t>
-            </w:r>
-            <w:proofErr w:type="spellEnd"/>
-            <w:r>
-              <w:rPr>
-                <w:rFonts w:ascii="Arial" w:eastAsia="Arial" w:hAnsi="Arial" w:cs="Arial"/>
-              </w:rPr>
-              <w:t xml:space="preserve"> </w:t>
-            </w:r>
-            <w:proofErr w:type="spellStart"/>
-            <w:r>
-              <w:rPr>
-                <w:rFonts w:ascii="Arial" w:eastAsia="Arial" w:hAnsi="Arial" w:cs="Arial"/>
-              </w:rPr>
-              <w:t>Completo</w:t>
-            </w:r>
-            <w:proofErr w:type="spellEnd"/>
+            <w:r>
+              <w:rPr>
+                <w:rFonts w:ascii="Arial" w:eastAsia="Arial" w:hAnsi="Arial" w:cs="Arial"/>
+              </w:rPr>
+              <w:t>Código Completo</w:t>
+            </w:r>
           </w:p>
         </w:tc>
         <w:tc>
@@ -3748,33 +3730,11 @@
                 <w:rFonts w:ascii="Arial" w:eastAsia="Arial" w:hAnsi="Arial" w:cs="Arial"/>
               </w:rPr>
             </w:pPr>
-            <w:proofErr w:type="spellStart"/>
-            <w:r>
-              <w:rPr>
-                <w:rFonts w:ascii="Arial" w:eastAsia="Arial" w:hAnsi="Arial" w:cs="Arial"/>
-              </w:rPr>
-              <w:t>Nombre</w:t>
-            </w:r>
-            <w:proofErr w:type="spellEnd"/>
-            <w:r>
-              <w:rPr>
-                <w:rFonts w:ascii="Arial" w:eastAsia="Arial" w:hAnsi="Arial" w:cs="Arial"/>
-              </w:rPr>
-              <w:t xml:space="preserve"> de la </w:t>
-            </w:r>
-            <w:proofErr w:type="spellStart"/>
-            <w:r>
-              <w:rPr>
-                <w:rFonts w:ascii="Arial" w:eastAsia="Arial" w:hAnsi="Arial" w:cs="Arial"/>
-              </w:rPr>
-              <w:t>Cuenta</w:t>
-            </w:r>
-            <w:proofErr w:type="spellEnd"/>
-            <w:r>
-              <w:rPr>
-                <w:rFonts w:ascii="Arial" w:eastAsia="Arial" w:hAnsi="Arial" w:cs="Arial"/>
-              </w:rPr>
-              <w:t xml:space="preserve"> </w:t>
+            <w:r>
+              <w:rPr>
+                <w:rFonts w:ascii="Arial" w:eastAsia="Arial" w:hAnsi="Arial" w:cs="Arial"/>
+              </w:rPr>
+              <w:t xml:space="preserve">Nombre de la Cuenta </w:t>
             </w:r>
           </w:p>
         </w:tc>
@@ -3789,19 +3749,11 @@
                 <w:rFonts w:ascii="Arial" w:eastAsia="Arial" w:hAnsi="Arial" w:cs="Arial"/>
               </w:rPr>
             </w:pPr>
-            <w:proofErr w:type="spellStart"/>
-            <w:r>
-              <w:rPr>
-                <w:rFonts w:ascii="Arial" w:eastAsia="Arial" w:hAnsi="Arial" w:cs="Arial"/>
-              </w:rPr>
-              <w:t>Clasificación</w:t>
-            </w:r>
-            <w:proofErr w:type="spellEnd"/>
-            <w:r>
-              <w:rPr>
-                <w:rFonts w:ascii="Arial" w:eastAsia="Arial" w:hAnsi="Arial" w:cs="Arial"/>
-              </w:rPr>
-              <w:t xml:space="preserve"> </w:t>
+            <w:r>
+              <w:rPr>
+                <w:rFonts w:ascii="Arial" w:eastAsia="Arial" w:hAnsi="Arial" w:cs="Arial"/>
+              </w:rPr>
+              <w:t xml:space="preserve">Clasificación </w:t>
             </w:r>
           </w:p>
         </w:tc>
@@ -3872,14 +3824,12 @@
                 <w:rFonts w:ascii="Arial" w:eastAsia="Arial" w:hAnsi="Arial" w:cs="Arial"/>
               </w:rPr>
             </w:pPr>
-            <w:proofErr w:type="spellStart"/>
             <w:r>
               <w:rPr>
                 <w:rFonts w:ascii="Arial" w:eastAsia="Arial" w:hAnsi="Arial" w:cs="Arial"/>
               </w:rPr>
               <w:t>Funcionamiento</w:t>
             </w:r>
-            <w:proofErr w:type="spellEnd"/>
           </w:p>
         </w:tc>
       </w:tr>
@@ -4024,28 +3974,12 @@
                 <w:rFonts w:ascii="Arial" w:eastAsia="Arial" w:hAnsi="Arial" w:cs="Arial"/>
               </w:rPr>
             </w:pPr>
-            <w:proofErr w:type="spellStart"/>
-            <w:r>
-              <w:rPr>
-                <w:rFonts w:ascii="Arial" w:eastAsia="Arial" w:hAnsi="Arial" w:cs="Arial"/>
-              </w:rPr>
-              <w:t>Código</w:t>
-            </w:r>
-            <w:proofErr w:type="spellEnd"/>
-            <w:r>
-              <w:rPr>
-                <w:rFonts w:ascii="Arial" w:eastAsia="Arial" w:hAnsi="Arial" w:cs="Arial"/>
-              </w:rPr>
-              <w:t xml:space="preserve"> </w:t>
-            </w:r>
-            <w:proofErr w:type="spellStart"/>
-            <w:r>
-              <w:rPr>
-                <w:rFonts w:ascii="Arial" w:eastAsia="Arial" w:hAnsi="Arial" w:cs="Arial"/>
-              </w:rPr>
-              <w:t>Completo</w:t>
-            </w:r>
-            <w:proofErr w:type="spellEnd"/>
+            <w:r>
+              <w:rPr>
+                <w:rFonts w:ascii="Arial" w:eastAsia="Arial" w:hAnsi="Arial" w:cs="Arial"/>
+              </w:rPr>
+              <w:t>Código Completo</w:t>
+            </w:r>
           </w:p>
         </w:tc>
         <w:tc>
@@ -4059,33 +3993,11 @@
                 <w:rFonts w:ascii="Arial" w:eastAsia="Arial" w:hAnsi="Arial" w:cs="Arial"/>
               </w:rPr>
             </w:pPr>
-            <w:proofErr w:type="spellStart"/>
-            <w:r>
-              <w:rPr>
-                <w:rFonts w:ascii="Arial" w:eastAsia="Arial" w:hAnsi="Arial" w:cs="Arial"/>
-              </w:rPr>
-              <w:t>Nombre</w:t>
-            </w:r>
-            <w:proofErr w:type="spellEnd"/>
-            <w:r>
-              <w:rPr>
-                <w:rFonts w:ascii="Arial" w:eastAsia="Arial" w:hAnsi="Arial" w:cs="Arial"/>
-              </w:rPr>
-              <w:t xml:space="preserve"> de la </w:t>
-            </w:r>
-            <w:proofErr w:type="spellStart"/>
-            <w:r>
-              <w:rPr>
-                <w:rFonts w:ascii="Arial" w:eastAsia="Arial" w:hAnsi="Arial" w:cs="Arial"/>
-              </w:rPr>
-              <w:t>Cuenta</w:t>
-            </w:r>
-            <w:proofErr w:type="spellEnd"/>
-            <w:r>
-              <w:rPr>
-                <w:rFonts w:ascii="Arial" w:eastAsia="Arial" w:hAnsi="Arial" w:cs="Arial"/>
-              </w:rPr>
-              <w:t xml:space="preserve"> </w:t>
+            <w:r>
+              <w:rPr>
+                <w:rFonts w:ascii="Arial" w:eastAsia="Arial" w:hAnsi="Arial" w:cs="Arial"/>
+              </w:rPr>
+              <w:t xml:space="preserve">Nombre de la Cuenta </w:t>
             </w:r>
           </w:p>
         </w:tc>
@@ -4100,14 +4012,12 @@
                 <w:rFonts w:ascii="Arial" w:eastAsia="Arial" w:hAnsi="Arial" w:cs="Arial"/>
               </w:rPr>
             </w:pPr>
-            <w:proofErr w:type="spellStart"/>
             <w:r>
               <w:rPr>
                 <w:rFonts w:ascii="Arial" w:eastAsia="Arial" w:hAnsi="Arial" w:cs="Arial"/>
               </w:rPr>
               <w:t>Clasificación</w:t>
             </w:r>
-            <w:proofErr w:type="spellEnd"/>
           </w:p>
         </w:tc>
       </w:tr>
@@ -4145,19 +4055,11 @@
                 <w:rFonts w:ascii="Arial" w:eastAsia="Arial" w:hAnsi="Arial" w:cs="Arial"/>
               </w:rPr>
             </w:pPr>
-            <w:proofErr w:type="spellStart"/>
-            <w:r>
-              <w:rPr>
-                <w:rFonts w:ascii="Arial" w:eastAsia="Arial" w:hAnsi="Arial" w:cs="Arial"/>
-              </w:rPr>
-              <w:t>Servicios</w:t>
-            </w:r>
-            <w:proofErr w:type="spellEnd"/>
-            <w:r>
-              <w:rPr>
-                <w:rFonts w:ascii="Arial" w:eastAsia="Arial" w:hAnsi="Arial" w:cs="Arial"/>
-              </w:rPr>
-              <w:t xml:space="preserve"> de la Construcción </w:t>
+            <w:r>
+              <w:rPr>
+                <w:rFonts w:ascii="Arial" w:eastAsia="Arial" w:hAnsi="Arial" w:cs="Arial"/>
+              </w:rPr>
+              <w:t xml:space="preserve">Servicios de la Construcción </w:t>
             </w:r>
           </w:p>
         </w:tc>
@@ -5324,8 +5226,16 @@
           <w:rFonts w:ascii="Arial" w:eastAsia="Arial" w:hAnsi="Arial" w:cs="Arial"/>
         </w:rPr>
         <w:lastRenderedPageBreak/>
+        <w:t>{{OCULTAR_SI_NO_ES_PAA}}</w:t>
+      </w:r>
+      <w:r>
+        <w:rPr>
+          <w:rFonts w:ascii="Arial" w:eastAsia="Arial" w:hAnsi="Arial" w:cs="Arial"/>
+        </w:rPr>
         <w:t>El Plan Anual de Adquisiciones de la Entidad no ha sido publicado, por no haberse vencido los términos legales establecidos en la Circular Externa Única de Colombia Compra Eficiente Versión 02 del 15 de julio de 2022, página 26 apartado 5.6 Publicación del Plan Anual de Adquisiciones: Las Entidades Estatales deben publicar el Plan Anual de Adquisiciones en el SECOP a más tardar el 31 de enero de cada año, identificando los bienes y servicios con el Clasificador de Bienes y Servicios de Naciones Unidas (UNSPSC).</w:t>
       </w:r>
+      <w:bookmarkStart w:id="3" w:name="_GoBack"/>
+      <w:bookmarkEnd w:id="3"/>
     </w:p>
     <w:p>
       <w:pPr>
@@ -8137,27 +8047,7 @@
                 <w:sz w:val="20"/>
                 <w:szCs w:val="20"/>
               </w:rPr>
-              <w:t xml:space="preserve">72 </w:t>
-            </w:r>
-            <w:proofErr w:type="spellStart"/>
-            <w:r>
-              <w:rPr>
-                <w:rFonts w:ascii="Arial" w:eastAsia="Arial" w:hAnsi="Arial" w:cs="Arial"/>
-                <w:color w:val="000000"/>
-                <w:sz w:val="20"/>
-                <w:szCs w:val="20"/>
-              </w:rPr>
-              <w:t>meses</w:t>
-            </w:r>
-            <w:proofErr w:type="spellEnd"/>
-            <w:r>
-              <w:rPr>
-                <w:rFonts w:ascii="Arial" w:eastAsia="Arial" w:hAnsi="Arial" w:cs="Arial"/>
-                <w:color w:val="000000"/>
-                <w:sz w:val="20"/>
-                <w:szCs w:val="20"/>
-              </w:rPr>
-              <w:t xml:space="preserve"> de experiencia profesional</w:t>
+              <w:t>72 meses de experiencia profesional</w:t>
             </w:r>
           </w:p>
         </w:tc>
@@ -11405,8 +11295,8 @@
           <w:rFonts w:ascii="Arial" w:eastAsia="Arial" w:hAnsi="Arial" w:cs="Arial"/>
         </w:rPr>
       </w:pPr>
-      <w:bookmarkStart w:id="3" w:name="_heading=h.r3dr7nhpwojl" w:colFirst="0" w:colLast="0"/>
-      <w:bookmarkEnd w:id="3"/>
+      <w:bookmarkStart w:id="4" w:name="_heading=h.r3dr7nhpwojl" w:colFirst="0" w:colLast="0"/>
+      <w:bookmarkEnd w:id="4"/>
       <w:r>
         <w:rPr>
           <w:rFonts w:ascii="Arial" w:eastAsia="Arial" w:hAnsi="Arial" w:cs="Arial"/>
@@ -14244,14 +14134,12 @@
                 <w:rFonts w:ascii="Arial" w:eastAsia="Arial" w:hAnsi="Arial" w:cs="Arial"/>
               </w:rPr>
             </w:pPr>
-            <w:proofErr w:type="spellStart"/>
             <w:r>
               <w:rPr>
                 <w:rFonts w:ascii="Arial" w:eastAsia="Arial" w:hAnsi="Arial" w:cs="Arial"/>
               </w:rPr>
               <w:t>Supervisión</w:t>
             </w:r>
-            <w:proofErr w:type="spellEnd"/>
           </w:p>
         </w:tc>
         <w:tc>
@@ -14311,14 +14199,12 @@
                 <w:rFonts w:ascii="Arial" w:eastAsia="Arial" w:hAnsi="Arial" w:cs="Arial"/>
               </w:rPr>
             </w:pPr>
-            <w:proofErr w:type="spellStart"/>
             <w:r>
               <w:rPr>
                 <w:rFonts w:ascii="Arial" w:eastAsia="Arial" w:hAnsi="Arial" w:cs="Arial"/>
               </w:rPr>
               <w:t>Interventoría</w:t>
             </w:r>
-            <w:proofErr w:type="spellEnd"/>
           </w:p>
         </w:tc>
         <w:tc>
@@ -14860,8 +14746,6 @@
           <w:szCs w:val="16"/>
         </w:rPr>
       </w:pPr>
-      <w:bookmarkStart w:id="4" w:name="_GoBack"/>
-      <w:bookmarkEnd w:id="4"/>
     </w:p>
     <w:p>
       <w:pPr>
@@ -15136,7 +15020,7 @@
         <w:sz w:val="16"/>
         <w:szCs w:val="16"/>
       </w:rPr>
-      <w:t>25</w:t>
+      <w:t>11</w:t>
     </w:r>
     <w:r>
       <w:rPr>
@@ -20874,7 +20758,7 @@
   <a:extraClrSchemeLst/>
   <a:extLst>
     <a:ext uri="{05A4C25C-085E-4340-85A3-A5531E510DB2}">
-      <thm15:themeFamily xmlns="" xmlns:thm15="http://schemas.microsoft.com/office/thememl/2012/main" name="Office Theme" id="{62F939B6-93AF-4DB8-9C6B-D6C7DFDC589F}" vid="{4A3C46E8-61CC-4603-A589-7422A47A8E4A}"/>
+      <thm15:themeFamily xmlns:thm15="http://schemas.microsoft.com/office/thememl/2012/main" xmlns="" name="Office Theme" id="{62F939B6-93AF-4DB8-9C6B-D6C7DFDC589F}" vid="{4A3C46E8-61CC-4603-A589-7422A47A8E4A}"/>
     </a:ext>
   </a:extLst>
 </a:theme>
@@ -20900,7 +20784,7 @@
 </file>
 
 <file path=customXml/itemProps2.xml><?xml version="1.0" encoding="utf-8"?>
-<ds:datastoreItem xmlns:ds="http://schemas.openxmlformats.org/officeDocument/2006/customXml" ds:itemID="{AB3721AB-943E-4974-A299-5083453149E1}">
+<ds:datastoreItem xmlns:ds="http://schemas.openxmlformats.org/officeDocument/2006/customXml" ds:itemID="{ACA37E67-E8BD-49B6-98AF-8DA48F2DB0C5}">
   <ds:schemaRefs>
     <ds:schemaRef ds:uri="http://schemas.openxmlformats.org/officeDocument/2006/bibliography"/>
   </ds:schemaRefs>

</xml_diff>